<commit_message>
Update Table 4.17: Papakyriakou row with T2/T48 speedup and efficiency
Co-Authored-By: Claude Sonnet 5.5 <noreply@anthropic.com>
Claude-Session: https://claude.ai/code/session_01T6gEewJ8YaCdmnsfS34RJd
</commit_message>
<xml_diff>
--- a/results/Section_4_9_final.docx
+++ b/results/Section_4_9_final.docx
@@ -1010,7 +1010,7 @@
                 <w:b w:val="0"/>
                 <w:sz w:val="20"/>
               </w:rPr>
-              <w:t>≈10× relative to the two-process runᵃ</w:t>
+              <w:t>≈10.05× relative to the two-process run (181.83 s to 18.09 s); efficiency 41.89% at 48 processesᵃ</w:t>
             </w:r>
           </w:p>
         </w:tc>
@@ -1150,7 +1150,7 @@
           <w:i/>
           <w:sz w:val="19"/>
         </w:rPr>
-        <w:t>ᵃ Papakyriakou et al. used the two-process execution as the baseline (runtime reduced from 181.83 s to 18.09 s, i.e., ≈10.05×; values to be checked against the paper). The studies differ in application, workload, hardware, process count, and speedup baseline; therefore, the values represent a contextual comparison rather than a direct performance ranking. The 9.19× value is the mean LBG-stage speedup over the eight test images; the total speedup includes the non-parallel stages.</w:t>
+        <w:t>ᵃ Papakyriakou et al. used the two-process execution as the baseline (no sequential run); the speedup is computed from the total times as T2/T48, and the efficiency is relative to the same baseline. The studies differ in application, workload, hardware, process count, and speedup baseline; therefore, the values represent a contextual comparison rather than a direct performance ranking. The 9.19× value is the mean LBG-stage speedup over the eight test images; the total speedup includes the non-parallel stages.</w:t>
       </w:r>
     </w:p>
     <w:p>

</xml_diff>

<commit_message>
Table 4.17: add Baseline column
Co-Authored-By: Claude Sonnet 5.5 <noreply@anthropic.com>
Claude-Session: https://claude.ai/code/session_01T6gEewJ8YaCdmnsfS34RJd
</commit_message>
<xml_diff>
--- a/results/Section_4_9_final.docx
+++ b/results/Section_4_9_final.docx
@@ -824,54 +824,25 @@
         </w:tblBorders>
       </w:tblPr>
       <w:tblGrid>
-        <w:gridCol w:w="2351"/>
-        <w:gridCol w:w="2351"/>
-        <w:gridCol w:w="2351"/>
-        <w:gridCol w:w="2351"/>
+        <w:gridCol w:w="1881"/>
+        <w:gridCol w:w="1881"/>
+        <w:gridCol w:w="1881"/>
+        <w:gridCol w:w="1881"/>
+        <w:gridCol w:w="1881"/>
       </w:tblGrid>
       <w:tr>
         <w:tc>
           <w:tcPr>
-            <w:tcW w:type="dxa" w:w="1928"/>
+            <w:tcW w:type="dxa" w:w="1644"/>
           </w:tcPr>
           <w:p>
             <w:r/>
             <w:r>
               <w:rPr>
                 <w:b/>
-                <w:sz w:val="20"/>
+                <w:sz w:val="19"/>
               </w:rPr>
               <w:t>Study</w:t>
-            </w:r>
-          </w:p>
-        </w:tc>
-        <w:tc>
-          <w:tcPr>
-            <w:tcW w:type="dxa" w:w="2948"/>
-          </w:tcPr>
-          <w:p>
-            <w:r/>
-            <w:r>
-              <w:rPr>
-                <w:b/>
-                <w:sz w:val="20"/>
-              </w:rPr>
-              <w:t>Application</w:t>
-            </w:r>
-          </w:p>
-        </w:tc>
-        <w:tc>
-          <w:tcPr>
-            <w:tcW w:type="dxa" w:w="2381"/>
-          </w:tcPr>
-          <w:p>
-            <w:r/>
-            <w:r>
-              <w:rPr>
-                <w:b/>
-                <w:sz w:val="20"/>
-              </w:rPr>
-              <w:t>Computing resources</w:t>
             </w:r>
           </w:p>
         </w:tc>
@@ -884,7 +855,52 @@
             <w:r>
               <w:rPr>
                 <w:b/>
-                <w:sz w:val="20"/>
+                <w:sz w:val="19"/>
+              </w:rPr>
+              <w:t>Application</w:t>
+            </w:r>
+          </w:p>
+        </w:tc>
+        <w:tc>
+          <w:tcPr>
+            <w:tcW w:type="dxa" w:w="1871"/>
+          </w:tcPr>
+          <w:p>
+            <w:r/>
+            <w:r>
+              <w:rPr>
+                <w:b/>
+                <w:sz w:val="19"/>
+              </w:rPr>
+              <w:t>Computing resources</w:t>
+            </w:r>
+          </w:p>
+        </w:tc>
+        <w:tc>
+          <w:tcPr>
+            <w:tcW w:type="dxa" w:w="1361"/>
+          </w:tcPr>
+          <w:p>
+            <w:r/>
+            <w:r>
+              <w:rPr>
+                <w:b/>
+                <w:sz w:val="19"/>
+              </w:rPr>
+              <w:t>Baseline</w:t>
+            </w:r>
+          </w:p>
+        </w:tc>
+        <w:tc>
+          <w:tcPr>
+            <w:tcW w:type="dxa" w:w="2154"/>
+          </w:tcPr>
+          <w:p>
+            <w:r/>
+            <w:r>
+              <w:rPr>
+                <w:b/>
+                <w:sz w:val="19"/>
               </w:rPr>
               <w:t>Reported speedup</w:t>
             </w:r>
@@ -894,46 +910,16 @@
       <w:tr>
         <w:tc>
           <w:tcPr>
-            <w:tcW w:type="dxa" w:w="1928"/>
+            <w:tcW w:type="dxa" w:w="1644"/>
           </w:tcPr>
           <w:p>
             <w:r/>
             <w:r>
               <w:rPr>
                 <w:b w:val="0"/>
-                <w:sz w:val="20"/>
+                <w:sz w:val="19"/>
               </w:rPr>
               <w:t>Tanović et al. (2024)</w:t>
-            </w:r>
-          </w:p>
-        </w:tc>
-        <w:tc>
-          <w:tcPr>
-            <w:tcW w:type="dxa" w:w="2948"/>
-          </w:tcPr>
-          <w:p>
-            <w:r/>
-            <w:r>
-              <w:rPr>
-                <w:b w:val="0"/>
-                <w:sz w:val="20"/>
-              </w:rPr>
-              <w:t>Parallel k-means for image classification (MNIST variants)</w:t>
-            </w:r>
-          </w:p>
-        </w:tc>
-        <w:tc>
-          <w:tcPr>
-            <w:tcW w:type="dxa" w:w="2381"/>
-          </w:tcPr>
-          <w:p>
-            <w:r/>
-            <w:r>
-              <w:rPr>
-                <w:b w:val="0"/>
-                <w:sz w:val="20"/>
-              </w:rPr>
-              <w:t>12 processor cores, OpenMP and MPI</w:t>
             </w:r>
           </w:p>
         </w:tc>
@@ -946,7 +932,52 @@
             <w:r>
               <w:rPr>
                 <w:b w:val="0"/>
-                <w:sz w:val="20"/>
+                <w:sz w:val="19"/>
+              </w:rPr>
+              <w:t>Parallel k-means for image classification (MNIST variants)</w:t>
+            </w:r>
+          </w:p>
+        </w:tc>
+        <w:tc>
+          <w:tcPr>
+            <w:tcW w:type="dxa" w:w="1871"/>
+          </w:tcPr>
+          <w:p>
+            <w:r/>
+            <w:r>
+              <w:rPr>
+                <w:b w:val="0"/>
+                <w:sz w:val="19"/>
+              </w:rPr>
+              <w:t>12 processor cores, OpenMP and MPI</w:t>
+            </w:r>
+          </w:p>
+        </w:tc>
+        <w:tc>
+          <w:tcPr>
+            <w:tcW w:type="dxa" w:w="1361"/>
+          </w:tcPr>
+          <w:p>
+            <w:r/>
+            <w:r>
+              <w:rPr>
+                <w:b w:val="0"/>
+                <w:sz w:val="19"/>
+              </w:rPr>
+              <w:t>Not stated in the abstract</w:t>
+            </w:r>
+          </w:p>
+        </w:tc>
+        <w:tc>
+          <w:tcPr>
+            <w:tcW w:type="dxa" w:w="2154"/>
+          </w:tcPr>
+          <w:p>
+            <w:r/>
+            <w:r>
+              <w:rPr>
+                <w:b w:val="0"/>
+                <w:sz w:val="19"/>
               </w:rPr>
               <w:t>Up to 10.2×</w:t>
             </w:r>
@@ -956,46 +987,16 @@
       <w:tr>
         <w:tc>
           <w:tcPr>
-            <w:tcW w:type="dxa" w:w="1928"/>
+            <w:tcW w:type="dxa" w:w="1644"/>
           </w:tcPr>
           <w:p>
             <w:r/>
             <w:r>
               <w:rPr>
                 <w:b w:val="0"/>
-                <w:sz w:val="20"/>
+                <w:sz w:val="19"/>
               </w:rPr>
               <w:t>Papakyriakou et al. (2025)</w:t>
-            </w:r>
-          </w:p>
-        </w:tc>
-        <w:tc>
-          <w:tcPr>
-            <w:tcW w:type="dxa" w:w="2948"/>
-          </w:tcPr>
-          <w:p>
-            <w:r/>
-            <w:r>
-              <w:rPr>
-                <w:b w:val="0"/>
-                <w:sz w:val="20"/>
-              </w:rPr>
-              <w:t>MPI-based k-means clustering of 75 million synthetic 2D points</w:t>
-            </w:r>
-          </w:p>
-        </w:tc>
-        <w:tc>
-          <w:tcPr>
-            <w:tcW w:type="dxa" w:w="2381"/>
-          </w:tcPr>
-          <w:p>
-            <w:r/>
-            <w:r>
-              <w:rPr>
-                <w:b w:val="0"/>
-                <w:sz w:val="20"/>
-              </w:rPr>
-              <w:t>2–48 MPI processes on a Raspberry Pi cluster</w:t>
             </w:r>
           </w:p>
         </w:tc>
@@ -1008,9 +1009,54 @@
             <w:r>
               <w:rPr>
                 <w:b w:val="0"/>
-                <w:sz w:val="20"/>
+                <w:sz w:val="19"/>
               </w:rPr>
-              <w:t>≈10.05× relative to the two-process run (181.83 s to 18.09 s); efficiency 41.89% at 48 processesᵃ</w:t>
+              <w:t>MPI-based k-means clustering of 75 million synthetic 2D points</w:t>
+            </w:r>
+          </w:p>
+        </w:tc>
+        <w:tc>
+          <w:tcPr>
+            <w:tcW w:type="dxa" w:w="1871"/>
+          </w:tcPr>
+          <w:p>
+            <w:r/>
+            <w:r>
+              <w:rPr>
+                <w:b w:val="0"/>
+                <w:sz w:val="19"/>
+              </w:rPr>
+              <w:t>2–48 MPI processes on a Raspberry Pi cluster</w:t>
+            </w:r>
+          </w:p>
+        </w:tc>
+        <w:tc>
+          <w:tcPr>
+            <w:tcW w:type="dxa" w:w="1361"/>
+          </w:tcPr>
+          <w:p>
+            <w:r/>
+            <w:r>
+              <w:rPr>
+                <w:b w:val="0"/>
+                <w:sz w:val="19"/>
+              </w:rPr>
+              <w:t>Two-process run</w:t>
+            </w:r>
+          </w:p>
+        </w:tc>
+        <w:tc>
+          <w:tcPr>
+            <w:tcW w:type="dxa" w:w="2154"/>
+          </w:tcPr>
+          <w:p>
+            <w:r/>
+            <w:r>
+              <w:rPr>
+                <w:b w:val="0"/>
+                <w:sz w:val="19"/>
+              </w:rPr>
+              <w:t>≈10.05× (181.83 s to 18.09 s); efficiency 41.89% at 48 processesᵃ</w:t>
             </w:r>
           </w:p>
         </w:tc>
@@ -1018,46 +1064,16 @@
       <w:tr>
         <w:tc>
           <w:tcPr>
-            <w:tcW w:type="dxa" w:w="1928"/>
+            <w:tcW w:type="dxa" w:w="1644"/>
           </w:tcPr>
           <w:p>
             <w:r/>
             <w:r>
               <w:rPr>
                 <w:b w:val="0"/>
-                <w:sz w:val="20"/>
+                <w:sz w:val="19"/>
               </w:rPr>
               <w:t>Bystrov et al. (2023)</w:t>
-            </w:r>
-          </w:p>
-        </w:tc>
-        <w:tc>
-          <w:tcPr>
-            <w:tcW w:type="dxa" w:w="2948"/>
-          </w:tcPr>
-          <w:p>
-            <w:r/>
-            <w:r>
-              <w:rPr>
-                <w:b w:val="0"/>
-                <w:sz w:val="20"/>
-              </w:rPr>
-              <w:t>Discrete-element simulation with resource-aware weighted RCB partitioning</w:t>
-            </w:r>
-          </w:p>
-        </w:tc>
-        <w:tc>
-          <w:tcPr>
-            <w:tcW w:type="dxa" w:w="2381"/>
-          </w:tcPr>
-          <w:p>
-            <w:r/>
-            <w:r>
-              <w:rPr>
-                <w:b w:val="0"/>
-                <w:sz w:val="20"/>
-              </w:rPr>
-              <w:t>Eight heterogeneous containers, OpenCL and MPI</w:t>
             </w:r>
           </w:p>
         </w:tc>
@@ -1070,7 +1086,52 @@
             <w:r>
               <w:rPr>
                 <w:b w:val="0"/>
-                <w:sz w:val="20"/>
+                <w:sz w:val="19"/>
+              </w:rPr>
+              <w:t>Discrete-element simulation with resource-aware weighted RCB partitioning</w:t>
+            </w:r>
+          </w:p>
+        </w:tc>
+        <w:tc>
+          <w:tcPr>
+            <w:tcW w:type="dxa" w:w="1871"/>
+          </w:tcPr>
+          <w:p>
+            <w:r/>
+            <w:r>
+              <w:rPr>
+                <w:b w:val="0"/>
+                <w:sz w:val="19"/>
+              </w:rPr>
+              <w:t>Eight heterogeneous containers, OpenCL and MPI</w:t>
+            </w:r>
+          </w:p>
+        </w:tc>
+        <w:tc>
+          <w:tcPr>
+            <w:tcW w:type="dxa" w:w="1361"/>
+          </w:tcPr>
+          <w:p>
+            <w:r/>
+            <w:r>
+              <w:rPr>
+                <w:b w:val="0"/>
+                <w:sz w:val="19"/>
+              </w:rPr>
+              <w:t>Not stated in the abstract</w:t>
+            </w:r>
+          </w:p>
+        </w:tc>
+        <w:tc>
+          <w:tcPr>
+            <w:tcW w:type="dxa" w:w="2154"/>
+          </w:tcPr>
+          <w:p>
+            <w:r/>
+            <w:r>
+              <w:rPr>
+                <w:b w:val="0"/>
+                <w:sz w:val="19"/>
               </w:rPr>
               <w:t>Up to 6.0×</w:t>
             </w:r>
@@ -1080,46 +1141,16 @@
       <w:tr>
         <w:tc>
           <w:tcPr>
-            <w:tcW w:type="dxa" w:w="1928"/>
+            <w:tcW w:type="dxa" w:w="1644"/>
           </w:tcPr>
           <w:p>
             <w:r/>
             <w:r>
               <w:rPr>
                 <w:b/>
-                <w:sz w:val="20"/>
+                <w:sz w:val="19"/>
               </w:rPr>
               <w:t>This work</w:t>
-            </w:r>
-          </w:p>
-        </w:tc>
-        <w:tc>
-          <w:tcPr>
-            <w:tcW w:type="dxa" w:w="2948"/>
-          </w:tcPr>
-          <w:p>
-            <w:r/>
-            <w:r>
-              <w:rPr>
-                <w:b/>
-                <w:sz w:val="20"/>
-              </w:rPr>
-              <w:t>Parallel LBG-based image compression</w:t>
-            </w:r>
-          </w:p>
-        </w:tc>
-        <w:tc>
-          <w:tcPr>
-            <w:tcW w:type="dxa" w:w="2381"/>
-          </w:tcPr>
-          <w:p>
-            <w:r/>
-            <w:r>
-              <w:rPr>
-                <w:b/>
-                <w:sz w:val="20"/>
-              </w:rPr>
-              <w:t>14 MPI processes mapped to 6 P-cores and 8 E-cores</w:t>
             </w:r>
           </w:p>
         </w:tc>
@@ -1132,7 +1163,52 @@
             <w:r>
               <w:rPr>
                 <w:b/>
-                <w:sz w:val="20"/>
+                <w:sz w:val="19"/>
+              </w:rPr>
+              <w:t>Parallel LBG-based image compression</w:t>
+            </w:r>
+          </w:p>
+        </w:tc>
+        <w:tc>
+          <w:tcPr>
+            <w:tcW w:type="dxa" w:w="1871"/>
+          </w:tcPr>
+          <w:p>
+            <w:r/>
+            <w:r>
+              <w:rPr>
+                <w:b/>
+                <w:sz w:val="19"/>
+              </w:rPr>
+              <w:t>14 MPI processes mapped to 6 P-cores and 8 E-cores</w:t>
+            </w:r>
+          </w:p>
+        </w:tc>
+        <w:tc>
+          <w:tcPr>
+            <w:tcW w:type="dxa" w:w="1361"/>
+          </w:tcPr>
+          <w:p>
+            <w:r/>
+            <w:r>
+              <w:rPr>
+                <w:b/>
+                <w:sz w:val="19"/>
+              </w:rPr>
+              <w:t>Sequential program</w:t>
+            </w:r>
+          </w:p>
+        </w:tc>
+        <w:tc>
+          <w:tcPr>
+            <w:tcW w:type="dxa" w:w="2154"/>
+          </w:tcPr>
+          <w:p>
+            <w:r/>
+            <w:r>
+              <w:rPr>
+                <w:b/>
+                <w:sz w:val="19"/>
               </w:rPr>
               <w:t>9.19× average LBG-stage speedup; 5.00× (grayscale) and 6.84× (color) total speedup at P = 14</w:t>
             </w:r>

</xml_diff>

<commit_message>
Table 4.17: compact layout
Co-Authored-By: Claude Sonnet 5.5 <noreply@anthropic.com>
Claude-Session: https://claude.ai/code/session_01T6gEewJ8YaCdmnsfS34RJd
</commit_message>
<xml_diff>
--- a/results/Section_4_9_final.docx
+++ b/results/Section_4_9_final.docx
@@ -833,14 +833,14 @@
       <w:tr>
         <w:tc>
           <w:tcPr>
-            <w:tcW w:type="dxa" w:w="1644"/>
+            <w:tcW w:type="dxa" w:w="1928"/>
           </w:tcPr>
           <w:p>
             <w:r/>
             <w:r>
               <w:rPr>
                 <w:b/>
-                <w:sz w:val="19"/>
+                <w:sz w:val="20"/>
               </w:rPr>
               <w:t>Study</w:t>
             </w:r>
@@ -848,14 +848,14 @@
         </w:tc>
         <w:tc>
           <w:tcPr>
-            <w:tcW w:type="dxa" w:w="2268"/>
+            <w:tcW w:type="dxa" w:w="2041"/>
           </w:tcPr>
           <w:p>
             <w:r/>
             <w:r>
               <w:rPr>
                 <w:b/>
-                <w:sz w:val="19"/>
+                <w:sz w:val="20"/>
               </w:rPr>
               <w:t>Application</w:t>
             </w:r>
@@ -863,29 +863,29 @@
         </w:tc>
         <w:tc>
           <w:tcPr>
-            <w:tcW w:type="dxa" w:w="1871"/>
+            <w:tcW w:type="dxa" w:w="2041"/>
           </w:tcPr>
           <w:p>
             <w:r/>
             <w:r>
               <w:rPr>
                 <w:b/>
-                <w:sz w:val="19"/>
+                <w:sz w:val="20"/>
               </w:rPr>
-              <w:t>Computing resources</w:t>
+              <w:t>Resources</w:t>
             </w:r>
           </w:p>
         </w:tc>
         <w:tc>
           <w:tcPr>
-            <w:tcW w:type="dxa" w:w="1361"/>
+            <w:tcW w:type="dxa" w:w="1247"/>
           </w:tcPr>
           <w:p>
             <w:r/>
             <w:r>
               <w:rPr>
                 <w:b/>
-                <w:sz w:val="19"/>
+                <w:sz w:val="20"/>
               </w:rPr>
               <w:t>Baseline</w:t>
             </w:r>
@@ -893,16 +893,16 @@
         </w:tc>
         <w:tc>
           <w:tcPr>
-            <w:tcW w:type="dxa" w:w="2154"/>
+            <w:tcW w:type="dxa" w:w="2041"/>
           </w:tcPr>
           <w:p>
             <w:r/>
             <w:r>
               <w:rPr>
                 <w:b/>
-                <w:sz w:val="19"/>
+                <w:sz w:val="20"/>
               </w:rPr>
-              <w:t>Reported speedup</w:t>
+              <w:t>Speedup</w:t>
             </w:r>
           </w:p>
         </w:tc>
@@ -910,14 +910,14 @@
       <w:tr>
         <w:tc>
           <w:tcPr>
-            <w:tcW w:type="dxa" w:w="1644"/>
+            <w:tcW w:type="dxa" w:w="1928"/>
           </w:tcPr>
           <w:p>
             <w:r/>
             <w:r>
               <w:rPr>
                 <w:b w:val="0"/>
-                <w:sz w:val="19"/>
+                <w:sz w:val="20"/>
               </w:rPr>
               <w:t>Tanović et al. (2024)</w:t>
             </w:r>
@@ -925,59 +925,59 @@
         </w:tc>
         <w:tc>
           <w:tcPr>
-            <w:tcW w:type="dxa" w:w="2268"/>
+            <w:tcW w:type="dxa" w:w="2041"/>
           </w:tcPr>
           <w:p>
             <w:r/>
             <w:r>
               <w:rPr>
                 <w:b w:val="0"/>
-                <w:sz w:val="19"/>
+                <w:sz w:val="20"/>
               </w:rPr>
-              <w:t>Parallel k-means for image classification (MNIST variants)</w:t>
+              <w:t>k-means, image classification</w:t>
             </w:r>
           </w:p>
         </w:tc>
         <w:tc>
           <w:tcPr>
-            <w:tcW w:type="dxa" w:w="1871"/>
+            <w:tcW w:type="dxa" w:w="2041"/>
           </w:tcPr>
           <w:p>
             <w:r/>
             <w:r>
               <w:rPr>
                 <w:b w:val="0"/>
-                <w:sz w:val="19"/>
+                <w:sz w:val="20"/>
               </w:rPr>
-              <w:t>12 processor cores, OpenMP and MPI</w:t>
+              <w:t>12 cores (OpenMP + MPI)</w:t>
             </w:r>
           </w:p>
         </w:tc>
         <w:tc>
           <w:tcPr>
-            <w:tcW w:type="dxa" w:w="1361"/>
+            <w:tcW w:type="dxa" w:w="1247"/>
           </w:tcPr>
           <w:p>
             <w:r/>
             <w:r>
               <w:rPr>
                 <w:b w:val="0"/>
-                <w:sz w:val="19"/>
+                <w:sz w:val="20"/>
               </w:rPr>
-              <w:t>Not stated in the abstract</w:t>
+              <w:t>Not stated</w:t>
             </w:r>
           </w:p>
         </w:tc>
         <w:tc>
           <w:tcPr>
-            <w:tcW w:type="dxa" w:w="2154"/>
+            <w:tcW w:type="dxa" w:w="2041"/>
           </w:tcPr>
           <w:p>
             <w:r/>
             <w:r>
               <w:rPr>
                 <w:b w:val="0"/>
-                <w:sz w:val="19"/>
+                <w:sz w:val="20"/>
               </w:rPr>
               <w:t>Up to 10.2×</w:t>
             </w:r>
@@ -987,14 +987,14 @@
       <w:tr>
         <w:tc>
           <w:tcPr>
-            <w:tcW w:type="dxa" w:w="1644"/>
+            <w:tcW w:type="dxa" w:w="1928"/>
           </w:tcPr>
           <w:p>
             <w:r/>
             <w:r>
               <w:rPr>
                 <w:b w:val="0"/>
-                <w:sz w:val="19"/>
+                <w:sz w:val="20"/>
               </w:rPr>
               <w:t>Papakyriakou et al. (2025)</w:t>
             </w:r>
@@ -1002,61 +1002,61 @@
         </w:tc>
         <w:tc>
           <w:tcPr>
-            <w:tcW w:type="dxa" w:w="2268"/>
+            <w:tcW w:type="dxa" w:w="2041"/>
           </w:tcPr>
           <w:p>
             <w:r/>
             <w:r>
               <w:rPr>
                 <w:b w:val="0"/>
-                <w:sz w:val="19"/>
+                <w:sz w:val="20"/>
               </w:rPr>
-              <w:t>MPI-based k-means clustering of 75 million synthetic 2D points</w:t>
+              <w:t>k-means, 75 M synthetic points</w:t>
             </w:r>
           </w:p>
         </w:tc>
         <w:tc>
           <w:tcPr>
-            <w:tcW w:type="dxa" w:w="1871"/>
+            <w:tcW w:type="dxa" w:w="2041"/>
           </w:tcPr>
           <w:p>
             <w:r/>
             <w:r>
               <w:rPr>
                 <w:b w:val="0"/>
-                <w:sz w:val="19"/>
+                <w:sz w:val="20"/>
               </w:rPr>
-              <w:t>2–48 MPI processes on a Raspberry Pi cluster</w:t>
+              <w:t>2–48 MPI processes</w:t>
             </w:r>
           </w:p>
         </w:tc>
         <w:tc>
           <w:tcPr>
-            <w:tcW w:type="dxa" w:w="1361"/>
+            <w:tcW w:type="dxa" w:w="1247"/>
           </w:tcPr>
           <w:p>
             <w:r/>
             <w:r>
               <w:rPr>
                 <w:b w:val="0"/>
-                <w:sz w:val="19"/>
+                <w:sz w:val="20"/>
               </w:rPr>
-              <w:t>Two-process run</w:t>
+              <w:t>2 processes</w:t>
             </w:r>
           </w:p>
         </w:tc>
         <w:tc>
           <w:tcPr>
-            <w:tcW w:type="dxa" w:w="2154"/>
+            <w:tcW w:type="dxa" w:w="2041"/>
           </w:tcPr>
           <w:p>
             <w:r/>
             <w:r>
               <w:rPr>
                 <w:b w:val="0"/>
-                <w:sz w:val="19"/>
+                <w:sz w:val="20"/>
               </w:rPr>
-              <w:t>≈10.05× (181.83 s to 18.09 s); efficiency 41.89% at 48 processesᵃ</w:t>
+              <w:t>≈10.05×ᵃ</w:t>
             </w:r>
           </w:p>
         </w:tc>
@@ -1064,14 +1064,14 @@
       <w:tr>
         <w:tc>
           <w:tcPr>
-            <w:tcW w:type="dxa" w:w="1644"/>
+            <w:tcW w:type="dxa" w:w="1928"/>
           </w:tcPr>
           <w:p>
             <w:r/>
             <w:r>
               <w:rPr>
                 <w:b w:val="0"/>
-                <w:sz w:val="19"/>
+                <w:sz w:val="20"/>
               </w:rPr>
               <w:t>Bystrov et al. (2023)</w:t>
             </w:r>
@@ -1079,59 +1079,59 @@
         </w:tc>
         <w:tc>
           <w:tcPr>
-            <w:tcW w:type="dxa" w:w="2268"/>
+            <w:tcW w:type="dxa" w:w="2041"/>
           </w:tcPr>
           <w:p>
             <w:r/>
             <w:r>
               <w:rPr>
                 <w:b w:val="0"/>
-                <w:sz w:val="19"/>
+                <w:sz w:val="20"/>
               </w:rPr>
-              <w:t>Discrete-element simulation with resource-aware weighted RCB partitioning</w:t>
+              <w:t>Discrete-element simulation</w:t>
             </w:r>
           </w:p>
         </w:tc>
         <w:tc>
           <w:tcPr>
-            <w:tcW w:type="dxa" w:w="1871"/>
+            <w:tcW w:type="dxa" w:w="2041"/>
           </w:tcPr>
           <w:p>
             <w:r/>
             <w:r>
               <w:rPr>
                 <w:b w:val="0"/>
-                <w:sz w:val="19"/>
+                <w:sz w:val="20"/>
               </w:rPr>
-              <w:t>Eight heterogeneous containers, OpenCL and MPI</w:t>
+              <w:t>8 heterogeneous containers</w:t>
             </w:r>
           </w:p>
         </w:tc>
         <w:tc>
           <w:tcPr>
-            <w:tcW w:type="dxa" w:w="1361"/>
+            <w:tcW w:type="dxa" w:w="1247"/>
           </w:tcPr>
           <w:p>
             <w:r/>
             <w:r>
               <w:rPr>
                 <w:b w:val="0"/>
-                <w:sz w:val="19"/>
+                <w:sz w:val="20"/>
               </w:rPr>
-              <w:t>Sequential DEM implementation</w:t>
+              <w:t>Sequential</w:t>
             </w:r>
           </w:p>
         </w:tc>
         <w:tc>
           <w:tcPr>
-            <w:tcW w:type="dxa" w:w="2154"/>
+            <w:tcW w:type="dxa" w:w="2041"/>
           </w:tcPr>
           <w:p>
             <w:r/>
             <w:r>
               <w:rPr>
                 <w:b w:val="0"/>
-                <w:sz w:val="19"/>
+                <w:sz w:val="20"/>
               </w:rPr>
               <w:t>Up to 6.0×</w:t>
             </w:r>
@@ -1141,14 +1141,14 @@
       <w:tr>
         <w:tc>
           <w:tcPr>
-            <w:tcW w:type="dxa" w:w="1644"/>
+            <w:tcW w:type="dxa" w:w="1928"/>
           </w:tcPr>
           <w:p>
             <w:r/>
             <w:r>
               <w:rPr>
                 <w:b/>
-                <w:sz w:val="19"/>
+                <w:sz w:val="20"/>
               </w:rPr>
               <w:t>This work</w:t>
             </w:r>
@@ -1156,61 +1156,61 @@
         </w:tc>
         <w:tc>
           <w:tcPr>
-            <w:tcW w:type="dxa" w:w="2268"/>
+            <w:tcW w:type="dxa" w:w="2041"/>
           </w:tcPr>
           <w:p>
             <w:r/>
             <w:r>
               <w:rPr>
                 <w:b/>
-                <w:sz w:val="19"/>
+                <w:sz w:val="20"/>
               </w:rPr>
-              <w:t>Parallel LBG-based image compression</w:t>
+              <w:t>LBG image compression</w:t>
             </w:r>
           </w:p>
         </w:tc>
         <w:tc>
           <w:tcPr>
-            <w:tcW w:type="dxa" w:w="1871"/>
+            <w:tcW w:type="dxa" w:w="2041"/>
           </w:tcPr>
           <w:p>
             <w:r/>
             <w:r>
               <w:rPr>
                 <w:b/>
-                <w:sz w:val="19"/>
+                <w:sz w:val="20"/>
               </w:rPr>
-              <w:t>14 MPI processes mapped to 6 P-cores and 8 E-cores</w:t>
+              <w:t>14 MPI processes (6 P + 8 E cores)</w:t>
             </w:r>
           </w:p>
         </w:tc>
         <w:tc>
           <w:tcPr>
-            <w:tcW w:type="dxa" w:w="1361"/>
+            <w:tcW w:type="dxa" w:w="1247"/>
           </w:tcPr>
           <w:p>
             <w:r/>
             <w:r>
               <w:rPr>
                 <w:b/>
-                <w:sz w:val="19"/>
+                <w:sz w:val="20"/>
               </w:rPr>
-              <w:t>Sequential program</w:t>
+              <w:t>Sequential</w:t>
             </w:r>
           </w:p>
         </w:tc>
         <w:tc>
           <w:tcPr>
-            <w:tcW w:type="dxa" w:w="2154"/>
+            <w:tcW w:type="dxa" w:w="2041"/>
           </w:tcPr>
           <w:p>
             <w:r/>
             <w:r>
               <w:rPr>
                 <w:b/>
-                <w:sz w:val="19"/>
+                <w:sz w:val="20"/>
               </w:rPr>
-              <w:t>9.19× average LBG-stage speedup; 5.00× (grayscale) and 6.84× (color) total speedup at P = 14</w:t>
+              <w:t>9.19× (LBG stage); 5.00× / 6.84× (total, gray / color)</w:t>
             </w:r>
           </w:p>
         </w:tc>
@@ -1226,7 +1226,7 @@
           <w:i/>
           <w:sz w:val="19"/>
         </w:rPr>
-        <w:t>ᵃ Papakyriakou et al. used the two-process execution as the baseline (no sequential run); the speedup is computed from the total times as T2/T48, and the efficiency is relative to the same baseline. The studies differ in application, workload, hardware, process count, and speedup baseline; therefore, the values represent a contextual comparison rather than a direct performance ranking. The 9.19× value is the mean LBG-stage speedup over the eight test images; the total speedup includes the non-parallel stages.</w:t>
+        <w:t>ᵃ 181.83 s to 18.09 s (T₂/T₄₈, Tables 2 and 3, p. 50); efficiency 41.89% at 48 processes, relative to the two-process baseline. Tanović et al.: baseline not specified in the abstract. Bystrov et al.: resource-aware weighted RCB partitioning, OpenCL + MPI. This work: the 9.19× value is the mean LBG-stage speedup over the eight test images; the total speedup includes the non-parallel stages. The studies differ in application, workload, hardware, process count, and speedup baseline; the values therefore provide a contextual comparison rather than a direct performance ranking.</w:t>
       </w:r>
     </w:p>
     <w:p>

</xml_diff>